<commit_message>
Add crawl imports and deepen V18-compatible audits
</commit_message>
<xml_diff>
--- a/exports/Kakawa_Chocolates_Enterprise_SEO_Package_v19/02_Strategy/Kakawa_Enterprise_SEO_Strategy_v19.docx
+++ b/exports/Kakawa_Chocolates_Enterprise_SEO_Package_v19/02_Strategy/Kakawa_Enterprise_SEO_Strategy_v19.docx
@@ -252,7 +252,7 @@
     </w:p>
     <w:p>
       <w:r>
-        <w:t>The approved evidence boundary covers kakawachocolates.com.au, but weighted evidence coverage is 35.0%, below the 70% publication threshold. The current evidence supports a gated stabilisation and measurement programme rather than performance forecasting. Private analytics sources—Google Search Console and GA4—are unavailable, and market baselines for traffic, rankings, conversions, revenue, backlinks and performance are also unavailable. Risky assets, including crawl-graph changes, schema and production deployment, must remain approval-gated. No live systems have been changed.</w:t>
+        <w:t>The approved scope is kakawachocolates.com.au. Evidence coverage is 35.0%, below the 70% publication threshold, so no overall health score or performance forecast is supported. The immediate opportunity is controlled technical remediation and refresh of existing URLs across approved product, collection, commercial, brand, informational and seasonal intents. Private analytics and market baselines are unavailable: Google Search Console, GA4 and SEMrush credentials were not configured or collected. Risky deployment, schema and content assets should remain approval-gated pending Gate 1, Gate 2 and agency-admin decisions.</w:t>
       </w:r>
     </w:p>
     <w:p>
@@ -273,27 +273,27 @@
     </w:p>
     <w:p>
       <w:r>
-        <w:t>Establish the evidence and measurement foundation: Publication-quality evidence coverage is below threshold, while Google Search Console, GA4, SEMrush and PageSpeed data were not collected because credentials were unavailable. Implementation: Approve the evidence boundary and unavailable-source register, then connect and validate GSC, GA4, SEMrush and PageSpeed in staging. Define approved analytics events, conversion definitions and baseline capture before interpreting performance.</w:t>
+        <w:t>Establish the evidence boundary before publishing decisions: Evidence coverage is 35.0%, below the 70% publication threshold, and the overall health score is therefore withheld. Private analytics and market baselines are unavailable because GSC, GA4, SEMrush and PageSpeed data were not collected. Implementation: Record the evidence boundary and unavailable-source register; confirm the approved .com.au domain and exclusion rules; connect and validate GSC, GA4, SEMrush and PageSpeed where credentials become available, or preserve truthful unavailable states. Do not publish performance, ranking, conversion, revenue, backlink or forecast claims.</w:t>
       </w:r>
     </w:p>
     <w:p>
       <w:r>
-        <w:t>Reconcile crawl and URL-graph safety before deployment: HTTP 404 responses were observed on 42 of 357 fetched pages, and the approved sequence calls for reconciliation of crawl inventory, sitemaps, redirects and canonicals before remediation. Implementation: Review the affected URLs, reconcile the crawl inventory, sitemaps, redirects and canonical graph, and require zero graph safety failures before proceeding. Do not make live changes during review.</w:t>
+        <w:t>Prioritise crawl and template hygiene: The approved findings record HTTP 404 responses on 42 of 357 fetched pages, missing primary headings on 2 of 357 pages, missing meta descriptions on 12 of 357 pages, multiple primary headings on 3 of 357 pages and long document titles on 62 of 357 pages. Implementation: Validate each error URL and its ownership; review redirects and canonicals; then resolve priority title, meta-description and H1 issues on representative templates before broader implementation. Re-crawl staging and reconcile the normalized URL inventory after changes.</w:t>
       </w:r>
     </w:p>
     <w:p>
       <w:r>
-        <w:t>Prioritise high-confidence on-page remediation: The crawl identified long document titles on 62 of 357 pages, missing meta descriptions on 12, missing primary headings on 2 and multiple primary headings on 3. Implementation: Resolve and stage title, meta-description and heading findings after URL-graph reconciliation. Validate a representative template set before any broader release.</w:t>
+        <w:t>Refresh existing URLs rather than creating competing pages: The approved opportunity set contains 20 content-intent clusters, each with a decision to refresh an existing target and not create a competing URL. Implementation: Freeze one accountable URL per approved intent, document duplicate-title and H1 clusters, and maintain a cannibalization ledger. Prioritise existing targets such as the homepage, gift-box, chocolate-bar, praline-and-bonbon, single-origin, corporate, wedding, wholesale, shipping, journal and seasonal collection URLs only after editorial review.</w:t>
       </w:r>
     </w:p>
     <w:p>
       <w:r>
-        <w:t>Refresh approved commercial and collection targets without creating competing URLs: The approved opportunity set specifies refreshes to existing targets for corporate chocolate enquiries, wholesale enquiries, shipping support, brand education, chocolate bars, and pralines and bonbons. Implementation: Confirm one target per approved intent, then refresh the existing URLs and design evidence-supported internal-link modules. Editorial review is required before publication.</w:t>
+        <w:t>Keep redirects, canonicals, schema and releases approval-gated: The approved action sequence classifies redirect, canonical, product-template, schema and release activities as requiring agency-admin approval or other gated decisions. The limitations state that risky deployment proposals are withheld pending human Gate 1/Gate 2 and agency-admin decisions. Implementation: Use staging only for approved redirects and canonicals; validate product indexability, collection pagination and canonical targets; create a verified fact pack before proposing Product schema; deploy only approved page-specific schema candidates; re-crawl and run domain-safety, link, redirect, canonical and schema gates before any release.</w:t>
       </w:r>
     </w:p>
     <w:p>
       <w:r>
-        <w:t>Keep schema and production changes approval-gated: The approved action sequence classifies schema review and the final production decision as high implementation-risk activities, and content and risky deployment proposals are withheld pending human Gate 1, Gate 2 and agency-admin decisions. Implementation: Review page-specific schema candidates against verified facts, complete staging crawl and render QA, reconcile deliverables, and require a documented approve-or-revise decision before production deployment.</w:t>
+        <w:t>Build measurement before CRO or commercial performance claims: No traffic, ranking, conversion, revenue, backlink or performance forecast is present, and analytics validation is required before CRO claims or experiment baselines can be supported. Implementation: Validate GA4 events and conversion definitions, map priority journeys only after validation, and create an experiment backlog with approved baselines and owners. Until then, treat CRO and commercial impact as unavailable rather than inferred.</w:t>
       </w:r>
     </w:p>
     <w:p>
@@ -389,7 +389,7 @@
     </w:p>
     <w:p>
       <w:r>
-        <w:t>This acceptance build contains 6 distinct existing-page refresh opportunities; it does not pad the roadmap to twenty assets.</w:t>
+        <w:t>This acceptance build contains 20 distinct existing-page refresh opportunities; it does not pad the roadmap to twenty assets.</w:t>
       </w:r>
     </w:p>
     <w:p>
@@ -632,6 +632,922 @@
                 <w:color w:val="17201E"/>
                 <w:sz w:val="16"/>
               </w:rPr>
+              <w:t>Sydney artisan chocolate shopping guide</w:t>
+            </w:r>
+          </w:p>
+        </w:tc>
+        <w:tc>
+          <w:tcPr>
+            <w:tcW w:type="dxa" w:w="1152"/>
+            <w:vAlign w:val="top"/>
+            <w:tcMar>
+              <w:top w:w="90" w:type="dxa"/>
+              <w:start w:w="105" w:type="dxa"/>
+              <w:bottom w:w="90" w:type="dxa"/>
+              <w:end w:w="105" w:type="dxa"/>
+            </w:tcMar>
+          </w:tcPr>
+          <w:p>
+            <w:r>
+              <w:rPr>
+                <w:rFonts w:ascii="Source Sans 3" w:hAnsi="Source Sans 3"/>
+                <w:color w:val="17201E"/>
+                <w:sz w:val="16"/>
+              </w:rPr>
+              <w:t>brand and product discovery</w:t>
+            </w:r>
+          </w:p>
+        </w:tc>
+        <w:tc>
+          <w:tcPr>
+            <w:tcW w:type="dxa" w:w="2592"/>
+            <w:vAlign w:val="top"/>
+            <w:tcMar>
+              <w:top w:w="90" w:type="dxa"/>
+              <w:start w:w="105" w:type="dxa"/>
+              <w:bottom w:w="90" w:type="dxa"/>
+              <w:end w:w="105" w:type="dxa"/>
+            </w:tcMar>
+          </w:tcPr>
+          <w:p>
+            <w:r>
+              <w:rPr>
+                <w:rFonts w:ascii="Source Sans 3" w:hAnsi="Source Sans 3"/>
+                <w:color w:val="17201E"/>
+                <w:sz w:val="16"/>
+              </w:rPr>
+              <w:t>https://kakawachocolates.com.au/</w:t>
+            </w:r>
+          </w:p>
+        </w:tc>
+        <w:tc>
+          <w:tcPr>
+            <w:tcW w:type="dxa" w:w="1944"/>
+            <w:vAlign w:val="top"/>
+            <w:tcMar>
+              <w:top w:w="90" w:type="dxa"/>
+              <w:start w:w="105" w:type="dxa"/>
+              <w:bottom w:w="90" w:type="dxa"/>
+              <w:end w:w="105" w:type="dxa"/>
+            </w:tcMar>
+          </w:tcPr>
+          <w:p>
+            <w:r>
+              <w:rPr>
+                <w:rFonts w:ascii="Source Sans 3" w:hAnsi="Source Sans 3"/>
+                <w:color w:val="17201E"/>
+                <w:sz w:val="16"/>
+              </w:rPr>
+              <w:t>Refresh existing target; do not create a competing URL</w:t>
+            </w:r>
+          </w:p>
+        </w:tc>
+        <w:tc>
+          <w:tcPr>
+            <w:tcW w:type="dxa" w:w="1080"/>
+            <w:vAlign w:val="top"/>
+            <w:tcMar>
+              <w:top w:w="90" w:type="dxa"/>
+              <w:start w:w="105" w:type="dxa"/>
+              <w:bottom w:w="90" w:type="dxa"/>
+              <w:end w:w="105" w:type="dxa"/>
+            </w:tcMar>
+          </w:tcPr>
+          <w:p>
+            <w:r>
+              <w:rPr>
+                <w:rFonts w:ascii="Source Sans 3" w:hAnsi="Source Sans 3"/>
+                <w:color w:val="17201E"/>
+                <w:sz w:val="16"/>
+              </w:rPr>
+              <w:t>EV-0001</w:t>
+            </w:r>
+          </w:p>
+        </w:tc>
+      </w:tr>
+      <w:tr>
+        <w:tc>
+          <w:tcPr>
+            <w:tcW w:type="dxa" w:w="1800"/>
+            <w:vAlign w:val="top"/>
+            <w:tcMar>
+              <w:top w:w="90" w:type="dxa"/>
+              <w:start w:w="105" w:type="dxa"/>
+              <w:bottom w:w="90" w:type="dxa"/>
+              <w:end w:w="105" w:type="dxa"/>
+            </w:tcMar>
+            <w:shd w:fill="F6F2E9"/>
+          </w:tcPr>
+          <w:p>
+            <w:r>
+              <w:rPr>
+                <w:rFonts w:ascii="Source Sans 3" w:hAnsi="Source Sans 3"/>
+                <w:color w:val="17201E"/>
+                <w:sz w:val="16"/>
+              </w:rPr>
+              <w:t>Chocolate gift box selection guide</w:t>
+            </w:r>
+          </w:p>
+        </w:tc>
+        <w:tc>
+          <w:tcPr>
+            <w:tcW w:type="dxa" w:w="1152"/>
+            <w:vAlign w:val="top"/>
+            <w:tcMar>
+              <w:top w:w="90" w:type="dxa"/>
+              <w:start w:w="105" w:type="dxa"/>
+              <w:bottom w:w="90" w:type="dxa"/>
+              <w:end w:w="105" w:type="dxa"/>
+            </w:tcMar>
+            <w:shd w:fill="F6F2E9"/>
+          </w:tcPr>
+          <w:p>
+            <w:r>
+              <w:rPr>
+                <w:rFonts w:ascii="Source Sans 3" w:hAnsi="Source Sans 3"/>
+                <w:color w:val="17201E"/>
+                <w:sz w:val="16"/>
+              </w:rPr>
+              <w:t>gift selection</w:t>
+            </w:r>
+          </w:p>
+        </w:tc>
+        <w:tc>
+          <w:tcPr>
+            <w:tcW w:type="dxa" w:w="2592"/>
+            <w:vAlign w:val="top"/>
+            <w:tcMar>
+              <w:top w:w="90" w:type="dxa"/>
+              <w:start w:w="105" w:type="dxa"/>
+              <w:bottom w:w="90" w:type="dxa"/>
+              <w:end w:w="105" w:type="dxa"/>
+            </w:tcMar>
+            <w:shd w:fill="F6F2E9"/>
+          </w:tcPr>
+          <w:p>
+            <w:r>
+              <w:rPr>
+                <w:rFonts w:ascii="Source Sans 3" w:hAnsi="Source Sans 3"/>
+                <w:color w:val="17201E"/>
+                <w:sz w:val="16"/>
+              </w:rPr>
+              <w:t>https://kakawachocolates.com.au/collections/gift-boxes</w:t>
+            </w:r>
+          </w:p>
+        </w:tc>
+        <w:tc>
+          <w:tcPr>
+            <w:tcW w:type="dxa" w:w="1944"/>
+            <w:vAlign w:val="top"/>
+            <w:tcMar>
+              <w:top w:w="90" w:type="dxa"/>
+              <w:start w:w="105" w:type="dxa"/>
+              <w:bottom w:w="90" w:type="dxa"/>
+              <w:end w:w="105" w:type="dxa"/>
+            </w:tcMar>
+            <w:shd w:fill="F6F2E9"/>
+          </w:tcPr>
+          <w:p>
+            <w:r>
+              <w:rPr>
+                <w:rFonts w:ascii="Source Sans 3" w:hAnsi="Source Sans 3"/>
+                <w:color w:val="17201E"/>
+                <w:sz w:val="16"/>
+              </w:rPr>
+              <w:t>Refresh existing target; do not create a competing URL</w:t>
+            </w:r>
+          </w:p>
+        </w:tc>
+        <w:tc>
+          <w:tcPr>
+            <w:tcW w:type="dxa" w:w="1080"/>
+            <w:vAlign w:val="top"/>
+            <w:tcMar>
+              <w:top w:w="90" w:type="dxa"/>
+              <w:start w:w="105" w:type="dxa"/>
+              <w:bottom w:w="90" w:type="dxa"/>
+              <w:end w:w="105" w:type="dxa"/>
+            </w:tcMar>
+            <w:shd w:fill="F6F2E9"/>
+          </w:tcPr>
+          <w:p>
+            <w:r>
+              <w:rPr>
+                <w:rFonts w:ascii="Source Sans 3" w:hAnsi="Source Sans 3"/>
+                <w:color w:val="17201E"/>
+                <w:sz w:val="16"/>
+              </w:rPr>
+              <w:t>EV-0011</w:t>
+            </w:r>
+          </w:p>
+        </w:tc>
+      </w:tr>
+      <w:tr>
+        <w:tc>
+          <w:tcPr>
+            <w:tcW w:type="dxa" w:w="1800"/>
+            <w:vAlign w:val="top"/>
+            <w:tcMar>
+              <w:top w:w="90" w:type="dxa"/>
+              <w:start w:w="105" w:type="dxa"/>
+              <w:bottom w:w="90" w:type="dxa"/>
+              <w:end w:w="105" w:type="dxa"/>
+            </w:tcMar>
+          </w:tcPr>
+          <w:p>
+            <w:r>
+              <w:rPr>
+                <w:rFonts w:ascii="Source Sans 3" w:hAnsi="Source Sans 3"/>
+                <w:color w:val="17201E"/>
+                <w:sz w:val="16"/>
+              </w:rPr>
+              <w:t>Chocolate bar collection guide</w:t>
+            </w:r>
+          </w:p>
+        </w:tc>
+        <w:tc>
+          <w:tcPr>
+            <w:tcW w:type="dxa" w:w="1152"/>
+            <w:vAlign w:val="top"/>
+            <w:tcMar>
+              <w:top w:w="90" w:type="dxa"/>
+              <w:start w:w="105" w:type="dxa"/>
+              <w:bottom w:w="90" w:type="dxa"/>
+              <w:end w:w="105" w:type="dxa"/>
+            </w:tcMar>
+          </w:tcPr>
+          <w:p>
+            <w:r>
+              <w:rPr>
+                <w:rFonts w:ascii="Source Sans 3" w:hAnsi="Source Sans 3"/>
+                <w:color w:val="17201E"/>
+                <w:sz w:val="16"/>
+              </w:rPr>
+              <w:t>collection discovery</w:t>
+            </w:r>
+          </w:p>
+        </w:tc>
+        <w:tc>
+          <w:tcPr>
+            <w:tcW w:type="dxa" w:w="2592"/>
+            <w:vAlign w:val="top"/>
+            <w:tcMar>
+              <w:top w:w="90" w:type="dxa"/>
+              <w:start w:w="105" w:type="dxa"/>
+              <w:bottom w:w="90" w:type="dxa"/>
+              <w:end w:w="105" w:type="dxa"/>
+            </w:tcMar>
+          </w:tcPr>
+          <w:p>
+            <w:r>
+              <w:rPr>
+                <w:rFonts w:ascii="Source Sans 3" w:hAnsi="Source Sans 3"/>
+                <w:color w:val="17201E"/>
+                <w:sz w:val="16"/>
+              </w:rPr>
+              <w:t>https://kakawachocolates.com.au/collections/chocolate-bar</w:t>
+            </w:r>
+          </w:p>
+        </w:tc>
+        <w:tc>
+          <w:tcPr>
+            <w:tcW w:type="dxa" w:w="1944"/>
+            <w:vAlign w:val="top"/>
+            <w:tcMar>
+              <w:top w:w="90" w:type="dxa"/>
+              <w:start w:w="105" w:type="dxa"/>
+              <w:bottom w:w="90" w:type="dxa"/>
+              <w:end w:w="105" w:type="dxa"/>
+            </w:tcMar>
+          </w:tcPr>
+          <w:p>
+            <w:r>
+              <w:rPr>
+                <w:rFonts w:ascii="Source Sans 3" w:hAnsi="Source Sans 3"/>
+                <w:color w:val="17201E"/>
+                <w:sz w:val="16"/>
+              </w:rPr>
+              <w:t>Refresh existing target; do not create a competing URL</w:t>
+            </w:r>
+          </w:p>
+        </w:tc>
+        <w:tc>
+          <w:tcPr>
+            <w:tcW w:type="dxa" w:w="1080"/>
+            <w:vAlign w:val="top"/>
+            <w:tcMar>
+              <w:top w:w="90" w:type="dxa"/>
+              <w:start w:w="105" w:type="dxa"/>
+              <w:bottom w:w="90" w:type="dxa"/>
+              <w:end w:w="105" w:type="dxa"/>
+            </w:tcMar>
+          </w:tcPr>
+          <w:p>
+            <w:r>
+              <w:rPr>
+                <w:rFonts w:ascii="Source Sans 3" w:hAnsi="Source Sans 3"/>
+                <w:color w:val="17201E"/>
+                <w:sz w:val="16"/>
+              </w:rPr>
+              <w:t>EV-0006</w:t>
+            </w:r>
+          </w:p>
+        </w:tc>
+      </w:tr>
+      <w:tr>
+        <w:tc>
+          <w:tcPr>
+            <w:tcW w:type="dxa" w:w="1800"/>
+            <w:vAlign w:val="top"/>
+            <w:tcMar>
+              <w:top w:w="90" w:type="dxa"/>
+              <w:start w:w="105" w:type="dxa"/>
+              <w:bottom w:w="90" w:type="dxa"/>
+              <w:end w:w="105" w:type="dxa"/>
+            </w:tcMar>
+            <w:shd w:fill="F6F2E9"/>
+          </w:tcPr>
+          <w:p>
+            <w:r>
+              <w:rPr>
+                <w:rFonts w:ascii="Source Sans 3" w:hAnsi="Source Sans 3"/>
+                <w:color w:val="17201E"/>
+                <w:sz w:val="16"/>
+              </w:rPr>
+              <w:t>Praline and bonbon selection guide</w:t>
+            </w:r>
+          </w:p>
+        </w:tc>
+        <w:tc>
+          <w:tcPr>
+            <w:tcW w:type="dxa" w:w="1152"/>
+            <w:vAlign w:val="top"/>
+            <w:tcMar>
+              <w:top w:w="90" w:type="dxa"/>
+              <w:start w:w="105" w:type="dxa"/>
+              <w:bottom w:w="90" w:type="dxa"/>
+              <w:end w:w="105" w:type="dxa"/>
+            </w:tcMar>
+            <w:shd w:fill="F6F2E9"/>
+          </w:tcPr>
+          <w:p>
+            <w:r>
+              <w:rPr>
+                <w:rFonts w:ascii="Source Sans 3" w:hAnsi="Source Sans 3"/>
+                <w:color w:val="17201E"/>
+                <w:sz w:val="16"/>
+              </w:rPr>
+              <w:t>collection discovery</w:t>
+            </w:r>
+          </w:p>
+        </w:tc>
+        <w:tc>
+          <w:tcPr>
+            <w:tcW w:type="dxa" w:w="2592"/>
+            <w:vAlign w:val="top"/>
+            <w:tcMar>
+              <w:top w:w="90" w:type="dxa"/>
+              <w:start w:w="105" w:type="dxa"/>
+              <w:bottom w:w="90" w:type="dxa"/>
+              <w:end w:w="105" w:type="dxa"/>
+            </w:tcMar>
+            <w:shd w:fill="F6F2E9"/>
+          </w:tcPr>
+          <w:p>
+            <w:r>
+              <w:rPr>
+                <w:rFonts w:ascii="Source Sans 3" w:hAnsi="Source Sans 3"/>
+                <w:color w:val="17201E"/>
+                <w:sz w:val="16"/>
+              </w:rPr>
+              <w:t>https://kakawachocolates.com.au/collections/pralines-bonbons</w:t>
+            </w:r>
+          </w:p>
+        </w:tc>
+        <w:tc>
+          <w:tcPr>
+            <w:tcW w:type="dxa" w:w="1944"/>
+            <w:vAlign w:val="top"/>
+            <w:tcMar>
+              <w:top w:w="90" w:type="dxa"/>
+              <w:start w:w="105" w:type="dxa"/>
+              <w:bottom w:w="90" w:type="dxa"/>
+              <w:end w:w="105" w:type="dxa"/>
+            </w:tcMar>
+            <w:shd w:fill="F6F2E9"/>
+          </w:tcPr>
+          <w:p>
+            <w:r>
+              <w:rPr>
+                <w:rFonts w:ascii="Source Sans 3" w:hAnsi="Source Sans 3"/>
+                <w:color w:val="17201E"/>
+                <w:sz w:val="16"/>
+              </w:rPr>
+              <w:t>Refresh existing target; do not create a competing URL</w:t>
+            </w:r>
+          </w:p>
+        </w:tc>
+        <w:tc>
+          <w:tcPr>
+            <w:tcW w:type="dxa" w:w="1080"/>
+            <w:vAlign w:val="top"/>
+            <w:tcMar>
+              <w:top w:w="90" w:type="dxa"/>
+              <w:start w:w="105" w:type="dxa"/>
+              <w:bottom w:w="90" w:type="dxa"/>
+              <w:end w:w="105" w:type="dxa"/>
+            </w:tcMar>
+            <w:shd w:fill="F6F2E9"/>
+          </w:tcPr>
+          <w:p>
+            <w:r>
+              <w:rPr>
+                <w:rFonts w:ascii="Source Sans 3" w:hAnsi="Source Sans 3"/>
+                <w:color w:val="17201E"/>
+                <w:sz w:val="16"/>
+              </w:rPr>
+              <w:t>EV-0017</w:t>
+            </w:r>
+          </w:p>
+        </w:tc>
+      </w:tr>
+      <w:tr>
+        <w:tc>
+          <w:tcPr>
+            <w:tcW w:type="dxa" w:w="1800"/>
+            <w:vAlign w:val="top"/>
+            <w:tcMar>
+              <w:top w:w="90" w:type="dxa"/>
+              <w:start w:w="105" w:type="dxa"/>
+              <w:bottom w:w="90" w:type="dxa"/>
+              <w:end w:w="105" w:type="dxa"/>
+            </w:tcMar>
+          </w:tcPr>
+          <w:p>
+            <w:r>
+              <w:rPr>
+                <w:rFonts w:ascii="Source Sans 3" w:hAnsi="Source Sans 3"/>
+                <w:color w:val="17201E"/>
+                <w:sz w:val="16"/>
+              </w:rPr>
+              <w:t>Chocolate slab buying guide</w:t>
+            </w:r>
+          </w:p>
+        </w:tc>
+        <w:tc>
+          <w:tcPr>
+            <w:tcW w:type="dxa" w:w="1152"/>
+            <w:vAlign w:val="top"/>
+            <w:tcMar>
+              <w:top w:w="90" w:type="dxa"/>
+              <w:start w:w="105" w:type="dxa"/>
+              <w:bottom w:w="90" w:type="dxa"/>
+              <w:end w:w="105" w:type="dxa"/>
+            </w:tcMar>
+          </w:tcPr>
+          <w:p>
+            <w:r>
+              <w:rPr>
+                <w:rFonts w:ascii="Source Sans 3" w:hAnsi="Source Sans 3"/>
+                <w:color w:val="17201E"/>
+                <w:sz w:val="16"/>
+              </w:rPr>
+              <w:t>collection discovery</w:t>
+            </w:r>
+          </w:p>
+        </w:tc>
+        <w:tc>
+          <w:tcPr>
+            <w:tcW w:type="dxa" w:w="2592"/>
+            <w:vAlign w:val="top"/>
+            <w:tcMar>
+              <w:top w:w="90" w:type="dxa"/>
+              <w:start w:w="105" w:type="dxa"/>
+              <w:bottom w:w="90" w:type="dxa"/>
+              <w:end w:w="105" w:type="dxa"/>
+            </w:tcMar>
+          </w:tcPr>
+          <w:p>
+            <w:r>
+              <w:rPr>
+                <w:rFonts w:ascii="Source Sans 3" w:hAnsi="Source Sans 3"/>
+                <w:color w:val="17201E"/>
+                <w:sz w:val="16"/>
+              </w:rPr>
+              <w:t>https://kakawachocolates.com.au/collections/chocolate-slab</w:t>
+            </w:r>
+          </w:p>
+        </w:tc>
+        <w:tc>
+          <w:tcPr>
+            <w:tcW w:type="dxa" w:w="1944"/>
+            <w:vAlign w:val="top"/>
+            <w:tcMar>
+              <w:top w:w="90" w:type="dxa"/>
+              <w:start w:w="105" w:type="dxa"/>
+              <w:bottom w:w="90" w:type="dxa"/>
+              <w:end w:w="105" w:type="dxa"/>
+            </w:tcMar>
+          </w:tcPr>
+          <w:p>
+            <w:r>
+              <w:rPr>
+                <w:rFonts w:ascii="Source Sans 3" w:hAnsi="Source Sans 3"/>
+                <w:color w:val="17201E"/>
+                <w:sz w:val="16"/>
+              </w:rPr>
+              <w:t>Refresh existing target; do not create a competing URL</w:t>
+            </w:r>
+          </w:p>
+        </w:tc>
+        <w:tc>
+          <w:tcPr>
+            <w:tcW w:type="dxa" w:w="1080"/>
+            <w:vAlign w:val="top"/>
+            <w:tcMar>
+              <w:top w:w="90" w:type="dxa"/>
+              <w:start w:w="105" w:type="dxa"/>
+              <w:bottom w:w="90" w:type="dxa"/>
+              <w:end w:w="105" w:type="dxa"/>
+            </w:tcMar>
+          </w:tcPr>
+          <w:p>
+            <w:r>
+              <w:rPr>
+                <w:rFonts w:ascii="Source Sans 3" w:hAnsi="Source Sans 3"/>
+                <w:color w:val="17201E"/>
+                <w:sz w:val="16"/>
+              </w:rPr>
+              <w:t>EV-0008</w:t>
+            </w:r>
+          </w:p>
+        </w:tc>
+      </w:tr>
+      <w:tr>
+        <w:tc>
+          <w:tcPr>
+            <w:tcW w:type="dxa" w:w="1800"/>
+            <w:vAlign w:val="top"/>
+            <w:tcMar>
+              <w:top w:w="90" w:type="dxa"/>
+              <w:start w:w="105" w:type="dxa"/>
+              <w:bottom w:w="90" w:type="dxa"/>
+              <w:end w:w="105" w:type="dxa"/>
+            </w:tcMar>
+            <w:shd w:fill="F6F2E9"/>
+          </w:tcPr>
+          <w:p>
+            <w:r>
+              <w:rPr>
+                <w:rFonts w:ascii="Source Sans 3" w:hAnsi="Source Sans 3"/>
+                <w:color w:val="17201E"/>
+                <w:sz w:val="16"/>
+              </w:rPr>
+              <w:t>Single-origin chocolate collection guide</w:t>
+            </w:r>
+          </w:p>
+        </w:tc>
+        <w:tc>
+          <w:tcPr>
+            <w:tcW w:type="dxa" w:w="1152"/>
+            <w:vAlign w:val="top"/>
+            <w:tcMar>
+              <w:top w:w="90" w:type="dxa"/>
+              <w:start w:w="105" w:type="dxa"/>
+              <w:bottom w:w="90" w:type="dxa"/>
+              <w:end w:w="105" w:type="dxa"/>
+            </w:tcMar>
+            <w:shd w:fill="F6F2E9"/>
+          </w:tcPr>
+          <w:p>
+            <w:r>
+              <w:rPr>
+                <w:rFonts w:ascii="Source Sans 3" w:hAnsi="Source Sans 3"/>
+                <w:color w:val="17201E"/>
+                <w:sz w:val="16"/>
+              </w:rPr>
+              <w:t>product education</w:t>
+            </w:r>
+          </w:p>
+        </w:tc>
+        <w:tc>
+          <w:tcPr>
+            <w:tcW w:type="dxa" w:w="2592"/>
+            <w:vAlign w:val="top"/>
+            <w:tcMar>
+              <w:top w:w="90" w:type="dxa"/>
+              <w:start w:w="105" w:type="dxa"/>
+              <w:bottom w:w="90" w:type="dxa"/>
+              <w:end w:w="105" w:type="dxa"/>
+            </w:tcMar>
+            <w:shd w:fill="F6F2E9"/>
+          </w:tcPr>
+          <w:p>
+            <w:r>
+              <w:rPr>
+                <w:rFonts w:ascii="Source Sans 3" w:hAnsi="Source Sans 3"/>
+                <w:color w:val="17201E"/>
+                <w:sz w:val="16"/>
+              </w:rPr>
+              <w:t>https://kakawachocolates.com.au/collections/single-origin-chocolates</w:t>
+            </w:r>
+          </w:p>
+        </w:tc>
+        <w:tc>
+          <w:tcPr>
+            <w:tcW w:type="dxa" w:w="1944"/>
+            <w:vAlign w:val="top"/>
+            <w:tcMar>
+              <w:top w:w="90" w:type="dxa"/>
+              <w:start w:w="105" w:type="dxa"/>
+              <w:bottom w:w="90" w:type="dxa"/>
+              <w:end w:w="105" w:type="dxa"/>
+            </w:tcMar>
+            <w:shd w:fill="F6F2E9"/>
+          </w:tcPr>
+          <w:p>
+            <w:r>
+              <w:rPr>
+                <w:rFonts w:ascii="Source Sans 3" w:hAnsi="Source Sans 3"/>
+                <w:color w:val="17201E"/>
+                <w:sz w:val="16"/>
+              </w:rPr>
+              <w:t>Refresh existing target; do not create a competing URL</w:t>
+            </w:r>
+          </w:p>
+        </w:tc>
+        <w:tc>
+          <w:tcPr>
+            <w:tcW w:type="dxa" w:w="1080"/>
+            <w:vAlign w:val="top"/>
+            <w:tcMar>
+              <w:top w:w="90" w:type="dxa"/>
+              <w:start w:w="105" w:type="dxa"/>
+              <w:bottom w:w="90" w:type="dxa"/>
+              <w:end w:w="105" w:type="dxa"/>
+            </w:tcMar>
+            <w:shd w:fill="F6F2E9"/>
+          </w:tcPr>
+          <w:p>
+            <w:r>
+              <w:rPr>
+                <w:rFonts w:ascii="Source Sans 3" w:hAnsi="Source Sans 3"/>
+                <w:color w:val="17201E"/>
+                <w:sz w:val="16"/>
+              </w:rPr>
+              <w:t>EV-0018</w:t>
+            </w:r>
+          </w:p>
+        </w:tc>
+      </w:tr>
+      <w:tr>
+        <w:tc>
+          <w:tcPr>
+            <w:tcW w:type="dxa" w:w="1800"/>
+            <w:vAlign w:val="top"/>
+            <w:tcMar>
+              <w:top w:w="90" w:type="dxa"/>
+              <w:start w:w="105" w:type="dxa"/>
+              <w:bottom w:w="90" w:type="dxa"/>
+              <w:end w:w="105" w:type="dxa"/>
+            </w:tcMar>
+          </w:tcPr>
+          <w:p>
+            <w:r>
+              <w:rPr>
+                <w:rFonts w:ascii="Source Sans 3" w:hAnsi="Source Sans 3"/>
+                <w:color w:val="17201E"/>
+                <w:sz w:val="16"/>
+              </w:rPr>
+              <w:t>Design-your-own chocolate box guide</w:t>
+            </w:r>
+          </w:p>
+        </w:tc>
+        <w:tc>
+          <w:tcPr>
+            <w:tcW w:type="dxa" w:w="1152"/>
+            <w:vAlign w:val="top"/>
+            <w:tcMar>
+              <w:top w:w="90" w:type="dxa"/>
+              <w:start w:w="105" w:type="dxa"/>
+              <w:bottom w:w="90" w:type="dxa"/>
+              <w:end w:w="105" w:type="dxa"/>
+            </w:tcMar>
+          </w:tcPr>
+          <w:p>
+            <w:r>
+              <w:rPr>
+                <w:rFonts w:ascii="Source Sans 3" w:hAnsi="Source Sans 3"/>
+                <w:color w:val="17201E"/>
+                <w:sz w:val="16"/>
+              </w:rPr>
+              <w:t>custom selection</w:t>
+            </w:r>
+          </w:p>
+        </w:tc>
+        <w:tc>
+          <w:tcPr>
+            <w:tcW w:type="dxa" w:w="2592"/>
+            <w:vAlign w:val="top"/>
+            <w:tcMar>
+              <w:top w:w="90" w:type="dxa"/>
+              <w:start w:w="105" w:type="dxa"/>
+              <w:bottom w:w="90" w:type="dxa"/>
+              <w:end w:w="105" w:type="dxa"/>
+            </w:tcMar>
+          </w:tcPr>
+          <w:p>
+            <w:r>
+              <w:rPr>
+                <w:rFonts w:ascii="Source Sans 3" w:hAnsi="Source Sans 3"/>
+                <w:color w:val="17201E"/>
+                <w:sz w:val="16"/>
+              </w:rPr>
+              <w:t>https://kakawachocolates.com.au/collections/design-your-own-box</w:t>
+            </w:r>
+          </w:p>
+        </w:tc>
+        <w:tc>
+          <w:tcPr>
+            <w:tcW w:type="dxa" w:w="1944"/>
+            <w:vAlign w:val="top"/>
+            <w:tcMar>
+              <w:top w:w="90" w:type="dxa"/>
+              <w:start w:w="105" w:type="dxa"/>
+              <w:bottom w:w="90" w:type="dxa"/>
+              <w:end w:w="105" w:type="dxa"/>
+            </w:tcMar>
+          </w:tcPr>
+          <w:p>
+            <w:r>
+              <w:rPr>
+                <w:rFonts w:ascii="Source Sans 3" w:hAnsi="Source Sans 3"/>
+                <w:color w:val="17201E"/>
+                <w:sz w:val="16"/>
+              </w:rPr>
+              <w:t>Refresh existing target; do not create a competing URL</w:t>
+            </w:r>
+          </w:p>
+        </w:tc>
+        <w:tc>
+          <w:tcPr>
+            <w:tcW w:type="dxa" w:w="1080"/>
+            <w:vAlign w:val="top"/>
+            <w:tcMar>
+              <w:top w:w="90" w:type="dxa"/>
+              <w:start w:w="105" w:type="dxa"/>
+              <w:bottom w:w="90" w:type="dxa"/>
+              <w:end w:w="105" w:type="dxa"/>
+            </w:tcMar>
+          </w:tcPr>
+          <w:p>
+            <w:r>
+              <w:rPr>
+                <w:rFonts w:ascii="Source Sans 3" w:hAnsi="Source Sans 3"/>
+                <w:color w:val="17201E"/>
+                <w:sz w:val="16"/>
+              </w:rPr>
+              <w:t>EV-0081</w:t>
+            </w:r>
+          </w:p>
+        </w:tc>
+      </w:tr>
+      <w:tr>
+        <w:tc>
+          <w:tcPr>
+            <w:tcW w:type="dxa" w:w="1800"/>
+            <w:vAlign w:val="top"/>
+            <w:tcMar>
+              <w:top w:w="90" w:type="dxa"/>
+              <w:start w:w="105" w:type="dxa"/>
+              <w:bottom w:w="90" w:type="dxa"/>
+              <w:end w:w="105" w:type="dxa"/>
+            </w:tcMar>
+            <w:shd w:fill="F6F2E9"/>
+          </w:tcPr>
+          <w:p>
+            <w:r>
+              <w:rPr>
+                <w:rFonts w:ascii="Source Sans 3" w:hAnsi="Source Sans 3"/>
+                <w:color w:val="17201E"/>
+                <w:sz w:val="16"/>
+              </w:rPr>
+              <w:t>Confectionery collection guide</w:t>
+            </w:r>
+          </w:p>
+        </w:tc>
+        <w:tc>
+          <w:tcPr>
+            <w:tcW w:type="dxa" w:w="1152"/>
+            <w:vAlign w:val="top"/>
+            <w:tcMar>
+              <w:top w:w="90" w:type="dxa"/>
+              <w:start w:w="105" w:type="dxa"/>
+              <w:bottom w:w="90" w:type="dxa"/>
+              <w:end w:w="105" w:type="dxa"/>
+            </w:tcMar>
+            <w:shd w:fill="F6F2E9"/>
+          </w:tcPr>
+          <w:p>
+            <w:r>
+              <w:rPr>
+                <w:rFonts w:ascii="Source Sans 3" w:hAnsi="Source Sans 3"/>
+                <w:color w:val="17201E"/>
+                <w:sz w:val="16"/>
+              </w:rPr>
+              <w:t>collection discovery</w:t>
+            </w:r>
+          </w:p>
+        </w:tc>
+        <w:tc>
+          <w:tcPr>
+            <w:tcW w:type="dxa" w:w="2592"/>
+            <w:vAlign w:val="top"/>
+            <w:tcMar>
+              <w:top w:w="90" w:type="dxa"/>
+              <w:start w:w="105" w:type="dxa"/>
+              <w:bottom w:w="90" w:type="dxa"/>
+              <w:end w:w="105" w:type="dxa"/>
+            </w:tcMar>
+            <w:shd w:fill="F6F2E9"/>
+          </w:tcPr>
+          <w:p>
+            <w:r>
+              <w:rPr>
+                <w:rFonts w:ascii="Source Sans 3" w:hAnsi="Source Sans 3"/>
+                <w:color w:val="17201E"/>
+                <w:sz w:val="16"/>
+              </w:rPr>
+              <w:t>https://kakawachocolates.com.au/collections/confectionary</w:t>
+            </w:r>
+          </w:p>
+        </w:tc>
+        <w:tc>
+          <w:tcPr>
+            <w:tcW w:type="dxa" w:w="1944"/>
+            <w:vAlign w:val="top"/>
+            <w:tcMar>
+              <w:top w:w="90" w:type="dxa"/>
+              <w:start w:w="105" w:type="dxa"/>
+              <w:bottom w:w="90" w:type="dxa"/>
+              <w:end w:w="105" w:type="dxa"/>
+            </w:tcMar>
+            <w:shd w:fill="F6F2E9"/>
+          </w:tcPr>
+          <w:p>
+            <w:r>
+              <w:rPr>
+                <w:rFonts w:ascii="Source Sans 3" w:hAnsi="Source Sans 3"/>
+                <w:color w:val="17201E"/>
+                <w:sz w:val="16"/>
+              </w:rPr>
+              <w:t>Refresh existing target; do not create a competing URL</w:t>
+            </w:r>
+          </w:p>
+        </w:tc>
+        <w:tc>
+          <w:tcPr>
+            <w:tcW w:type="dxa" w:w="1080"/>
+            <w:vAlign w:val="top"/>
+            <w:tcMar>
+              <w:top w:w="90" w:type="dxa"/>
+              <w:start w:w="105" w:type="dxa"/>
+              <w:bottom w:w="90" w:type="dxa"/>
+              <w:end w:w="105" w:type="dxa"/>
+            </w:tcMar>
+            <w:shd w:fill="F6F2E9"/>
+          </w:tcPr>
+          <w:p>
+            <w:r>
+              <w:rPr>
+                <w:rFonts w:ascii="Source Sans 3" w:hAnsi="Source Sans 3"/>
+                <w:color w:val="17201E"/>
+                <w:sz w:val="16"/>
+              </w:rPr>
+              <w:t>EV-0009</w:t>
+            </w:r>
+          </w:p>
+        </w:tc>
+      </w:tr>
+      <w:tr>
+        <w:tc>
+          <w:tcPr>
+            <w:tcW w:type="dxa" w:w="1800"/>
+            <w:vAlign w:val="top"/>
+            <w:tcMar>
+              <w:top w:w="90" w:type="dxa"/>
+              <w:start w:w="105" w:type="dxa"/>
+              <w:bottom w:w="90" w:type="dxa"/>
+              <w:end w:w="105" w:type="dxa"/>
+            </w:tcMar>
+          </w:tcPr>
+          <w:p>
+            <w:r>
+              <w:rPr>
+                <w:rFonts w:ascii="Source Sans 3" w:hAnsi="Source Sans 3"/>
+                <w:color w:val="17201E"/>
+                <w:sz w:val="16"/>
+              </w:rPr>
               <w:t>Corporate chocolate enquiry guide</w:t>
             </w:r>
           </w:p>
@@ -745,7 +1661,236 @@
                 <w:color w:val="17201E"/>
                 <w:sz w:val="16"/>
               </w:rPr>
-              <w:t>Wholesale enquiry guide</w:t>
+              <w:t>Events and corporate chocolate planning guide</w:t>
+            </w:r>
+          </w:p>
+        </w:tc>
+        <w:tc>
+          <w:tcPr>
+            <w:tcW w:type="dxa" w:w="1152"/>
+            <w:vAlign w:val="top"/>
+            <w:tcMar>
+              <w:top w:w="90" w:type="dxa"/>
+              <w:start w:w="105" w:type="dxa"/>
+              <w:bottom w:w="90" w:type="dxa"/>
+              <w:end w:w="105" w:type="dxa"/>
+            </w:tcMar>
+            <w:shd w:fill="F6F2E9"/>
+          </w:tcPr>
+          <w:p>
+            <w:r>
+              <w:rPr>
+                <w:rFonts w:ascii="Source Sans 3" w:hAnsi="Source Sans 3"/>
+                <w:color w:val="17201E"/>
+                <w:sz w:val="16"/>
+              </w:rPr>
+              <w:t>event enquiry</w:t>
+            </w:r>
+          </w:p>
+        </w:tc>
+        <w:tc>
+          <w:tcPr>
+            <w:tcW w:type="dxa" w:w="2592"/>
+            <w:vAlign w:val="top"/>
+            <w:tcMar>
+              <w:top w:w="90" w:type="dxa"/>
+              <w:start w:w="105" w:type="dxa"/>
+              <w:bottom w:w="90" w:type="dxa"/>
+              <w:end w:w="105" w:type="dxa"/>
+            </w:tcMar>
+            <w:shd w:fill="F6F2E9"/>
+          </w:tcPr>
+          <w:p>
+            <w:r>
+              <w:rPr>
+                <w:rFonts w:ascii="Source Sans 3" w:hAnsi="Source Sans 3"/>
+                <w:color w:val="17201E"/>
+                <w:sz w:val="16"/>
+              </w:rPr>
+              <w:t>https://kakawachocolates.com.au/pages/events-corporates</w:t>
+            </w:r>
+          </w:p>
+        </w:tc>
+        <w:tc>
+          <w:tcPr>
+            <w:tcW w:type="dxa" w:w="1944"/>
+            <w:vAlign w:val="top"/>
+            <w:tcMar>
+              <w:top w:w="90" w:type="dxa"/>
+              <w:start w:w="105" w:type="dxa"/>
+              <w:bottom w:w="90" w:type="dxa"/>
+              <w:end w:w="105" w:type="dxa"/>
+            </w:tcMar>
+            <w:shd w:fill="F6F2E9"/>
+          </w:tcPr>
+          <w:p>
+            <w:r>
+              <w:rPr>
+                <w:rFonts w:ascii="Source Sans 3" w:hAnsi="Source Sans 3"/>
+                <w:color w:val="17201E"/>
+                <w:sz w:val="16"/>
+              </w:rPr>
+              <w:t>Refresh existing target; do not create a competing URL</w:t>
+            </w:r>
+          </w:p>
+        </w:tc>
+        <w:tc>
+          <w:tcPr>
+            <w:tcW w:type="dxa" w:w="1080"/>
+            <w:vAlign w:val="top"/>
+            <w:tcMar>
+              <w:top w:w="90" w:type="dxa"/>
+              <w:start w:w="105" w:type="dxa"/>
+              <w:bottom w:w="90" w:type="dxa"/>
+              <w:end w:w="105" w:type="dxa"/>
+            </w:tcMar>
+            <w:shd w:fill="F6F2E9"/>
+          </w:tcPr>
+          <w:p>
+            <w:r>
+              <w:rPr>
+                <w:rFonts w:ascii="Source Sans 3" w:hAnsi="Source Sans 3"/>
+                <w:color w:val="17201E"/>
+                <w:sz w:val="16"/>
+              </w:rPr>
+              <w:t>EV-0023</w:t>
+            </w:r>
+          </w:p>
+        </w:tc>
+      </w:tr>
+      <w:tr>
+        <w:tc>
+          <w:tcPr>
+            <w:tcW w:type="dxa" w:w="1800"/>
+            <w:vAlign w:val="top"/>
+            <w:tcMar>
+              <w:top w:w="90" w:type="dxa"/>
+              <w:start w:w="105" w:type="dxa"/>
+              <w:bottom w:w="90" w:type="dxa"/>
+              <w:end w:w="105" w:type="dxa"/>
+            </w:tcMar>
+          </w:tcPr>
+          <w:p>
+            <w:r>
+              <w:rPr>
+                <w:rFonts w:ascii="Source Sans 3" w:hAnsi="Source Sans 3"/>
+                <w:color w:val="17201E"/>
+                <w:sz w:val="16"/>
+              </w:rPr>
+              <w:t>Wedding chocolate planning guide</w:t>
+            </w:r>
+          </w:p>
+        </w:tc>
+        <w:tc>
+          <w:tcPr>
+            <w:tcW w:type="dxa" w:w="1152"/>
+            <w:vAlign w:val="top"/>
+            <w:tcMar>
+              <w:top w:w="90" w:type="dxa"/>
+              <w:start w:w="105" w:type="dxa"/>
+              <w:bottom w:w="90" w:type="dxa"/>
+              <w:end w:w="105" w:type="dxa"/>
+            </w:tcMar>
+          </w:tcPr>
+          <w:p>
+            <w:r>
+              <w:rPr>
+                <w:rFonts w:ascii="Source Sans 3" w:hAnsi="Source Sans 3"/>
+                <w:color w:val="17201E"/>
+                <w:sz w:val="16"/>
+              </w:rPr>
+              <w:t>wedding enquiry</w:t>
+            </w:r>
+          </w:p>
+        </w:tc>
+        <w:tc>
+          <w:tcPr>
+            <w:tcW w:type="dxa" w:w="2592"/>
+            <w:vAlign w:val="top"/>
+            <w:tcMar>
+              <w:top w:w="90" w:type="dxa"/>
+              <w:start w:w="105" w:type="dxa"/>
+              <w:bottom w:w="90" w:type="dxa"/>
+              <w:end w:w="105" w:type="dxa"/>
+            </w:tcMar>
+          </w:tcPr>
+          <w:p>
+            <w:r>
+              <w:rPr>
+                <w:rFonts w:ascii="Source Sans 3" w:hAnsi="Source Sans 3"/>
+                <w:color w:val="17201E"/>
+                <w:sz w:val="16"/>
+              </w:rPr>
+              <w:t>https://kakawachocolates.com.au/pages/wedding-chocolates</w:t>
+            </w:r>
+          </w:p>
+        </w:tc>
+        <w:tc>
+          <w:tcPr>
+            <w:tcW w:type="dxa" w:w="1944"/>
+            <w:vAlign w:val="top"/>
+            <w:tcMar>
+              <w:top w:w="90" w:type="dxa"/>
+              <w:start w:w="105" w:type="dxa"/>
+              <w:bottom w:w="90" w:type="dxa"/>
+              <w:end w:w="105" w:type="dxa"/>
+            </w:tcMar>
+          </w:tcPr>
+          <w:p>
+            <w:r>
+              <w:rPr>
+                <w:rFonts w:ascii="Source Sans 3" w:hAnsi="Source Sans 3"/>
+                <w:color w:val="17201E"/>
+                <w:sz w:val="16"/>
+              </w:rPr>
+              <w:t>Refresh existing target; do not create a competing URL</w:t>
+            </w:r>
+          </w:p>
+        </w:tc>
+        <w:tc>
+          <w:tcPr>
+            <w:tcW w:type="dxa" w:w="1080"/>
+            <w:vAlign w:val="top"/>
+            <w:tcMar>
+              <w:top w:w="90" w:type="dxa"/>
+              <w:start w:w="105" w:type="dxa"/>
+              <w:bottom w:w="90" w:type="dxa"/>
+              <w:end w:w="105" w:type="dxa"/>
+            </w:tcMar>
+          </w:tcPr>
+          <w:p>
+            <w:r>
+              <w:rPr>
+                <w:rFonts w:ascii="Source Sans 3" w:hAnsi="Source Sans 3"/>
+                <w:color w:val="17201E"/>
+                <w:sz w:val="16"/>
+              </w:rPr>
+              <w:t>EV-0033</w:t>
+            </w:r>
+          </w:p>
+        </w:tc>
+      </w:tr>
+      <w:tr>
+        <w:tc>
+          <w:tcPr>
+            <w:tcW w:type="dxa" w:w="1800"/>
+            <w:vAlign w:val="top"/>
+            <w:tcMar>
+              <w:top w:w="90" w:type="dxa"/>
+              <w:start w:w="105" w:type="dxa"/>
+              <w:bottom w:w="90" w:type="dxa"/>
+              <w:end w:w="105" w:type="dxa"/>
+            </w:tcMar>
+            <w:shd w:fill="F6F2E9"/>
+          </w:tcPr>
+          <w:p>
+            <w:r>
+              <w:rPr>
+                <w:rFonts w:ascii="Source Sans 3" w:hAnsi="Source Sans 3"/>
+                <w:color w:val="17201E"/>
+                <w:sz w:val="16"/>
+              </w:rPr>
+              <w:t>Wholesale chocolate enquiry guide</w:t>
             </w:r>
           </w:p>
         </w:tc>
@@ -974,7 +2119,7 @@
                 <w:color w:val="17201E"/>
                 <w:sz w:val="16"/>
               </w:rPr>
-              <w:t>How Kakawa presents its craft</w:t>
+              <w:t>About Kakawa evidence-led page refresh</w:t>
             </w:r>
           </w:p>
         </w:tc>
@@ -1020,7 +2165,7 @@
                 <w:color w:val="17201E"/>
                 <w:sz w:val="16"/>
               </w:rPr>
-              <w:t>https://kakawachocolates.com.au/pages/how-we-make-chocolate</w:t>
+              <w:t>https://kakawachocolates.com.au/pages/about-us</w:t>
             </w:r>
           </w:p>
         </w:tc>
@@ -1066,7 +2211,7 @@
                 <w:color w:val="17201E"/>
                 <w:sz w:val="16"/>
               </w:rPr>
-              <w:t>EV-0024</w:t>
+              <w:t>EV-0020</w:t>
             </w:r>
           </w:p>
         </w:tc>
@@ -1090,7 +2235,7 @@
                 <w:color w:val="17201E"/>
                 <w:sz w:val="16"/>
               </w:rPr>
-              <w:t>Chocolate bar collection guide</w:t>
+              <w:t>How Kakawa presents its chocolate-making process</w:t>
             </w:r>
           </w:p>
         </w:tc>
@@ -1112,7 +2257,7 @@
                 <w:color w:val="17201E"/>
                 <w:sz w:val="16"/>
               </w:rPr>
-              <w:t>collection discovery</w:t>
+              <w:t>brand education</w:t>
             </w:r>
           </w:p>
         </w:tc>
@@ -1134,7 +2279,7 @@
                 <w:color w:val="17201E"/>
                 <w:sz w:val="16"/>
               </w:rPr>
-              <w:t>https://kakawachocolates.com.au/collections/chocolate-bar</w:t>
+              <w:t>https://kakawachocolates.com.au/pages/how-we-make-chocolate</w:t>
             </w:r>
           </w:p>
         </w:tc>
@@ -1178,7 +2323,7 @@
                 <w:color w:val="17201E"/>
                 <w:sz w:val="16"/>
               </w:rPr>
-              <w:t>EV-0006</w:t>
+              <w:t>EV-0024</w:t>
             </w:r>
           </w:p>
         </w:tc>
@@ -1203,7 +2348,7 @@
                 <w:color w:val="17201E"/>
                 <w:sz w:val="16"/>
               </w:rPr>
-              <w:t>Praline and bonbon collection guide</w:t>
+              <w:t>Ingredients and ethics information guide</w:t>
             </w:r>
           </w:p>
         </w:tc>
@@ -1226,7 +2371,7 @@
                 <w:color w:val="17201E"/>
                 <w:sz w:val="16"/>
               </w:rPr>
-              <w:t>collection discovery</w:t>
+              <w:t>trust and product education</w:t>
             </w:r>
           </w:p>
         </w:tc>
@@ -1249,7 +2394,7 @@
                 <w:color w:val="17201E"/>
                 <w:sz w:val="16"/>
               </w:rPr>
-              <w:t>https://kakawachocolates.com.au/collections/pralines-bonbons</w:t>
+              <w:t>https://kakawachocolates.com.au/pages/our-ingredients-and-ethics</w:t>
             </w:r>
           </w:p>
         </w:tc>
@@ -1295,7 +2440,465 @@
                 <w:color w:val="17201E"/>
                 <w:sz w:val="16"/>
               </w:rPr>
-              <w:t>EV-0017</w:t>
+              <w:t>EV-0026</w:t>
+            </w:r>
+          </w:p>
+        </w:tc>
+      </w:tr>
+      <w:tr>
+        <w:tc>
+          <w:tcPr>
+            <w:tcW w:type="dxa" w:w="1800"/>
+            <w:vAlign w:val="top"/>
+            <w:tcMar>
+              <w:top w:w="90" w:type="dxa"/>
+              <w:start w:w="105" w:type="dxa"/>
+              <w:bottom w:w="90" w:type="dxa"/>
+              <w:end w:w="105" w:type="dxa"/>
+            </w:tcMar>
+          </w:tcPr>
+          <w:p>
+            <w:r>
+              <w:rPr>
+                <w:rFonts w:ascii="Source Sans 3" w:hAnsi="Source Sans 3"/>
+                <w:color w:val="17201E"/>
+                <w:sz w:val="16"/>
+              </w:rPr>
+              <w:t>Kakawa rewards information guide</w:t>
+            </w:r>
+          </w:p>
+        </w:tc>
+        <w:tc>
+          <w:tcPr>
+            <w:tcW w:type="dxa" w:w="1152"/>
+            <w:vAlign w:val="top"/>
+            <w:tcMar>
+              <w:top w:w="90" w:type="dxa"/>
+              <w:start w:w="105" w:type="dxa"/>
+              <w:bottom w:w="90" w:type="dxa"/>
+              <w:end w:w="105" w:type="dxa"/>
+            </w:tcMar>
+          </w:tcPr>
+          <w:p>
+            <w:r>
+              <w:rPr>
+                <w:rFonts w:ascii="Source Sans 3" w:hAnsi="Source Sans 3"/>
+                <w:color w:val="17201E"/>
+                <w:sz w:val="16"/>
+              </w:rPr>
+              <w:t>membership support</w:t>
+            </w:r>
+          </w:p>
+        </w:tc>
+        <w:tc>
+          <w:tcPr>
+            <w:tcW w:type="dxa" w:w="2592"/>
+            <w:vAlign w:val="top"/>
+            <w:tcMar>
+              <w:top w:w="90" w:type="dxa"/>
+              <w:start w:w="105" w:type="dxa"/>
+              <w:bottom w:w="90" w:type="dxa"/>
+              <w:end w:w="105" w:type="dxa"/>
+            </w:tcMar>
+          </w:tcPr>
+          <w:p>
+            <w:r>
+              <w:rPr>
+                <w:rFonts w:ascii="Source Sans 3" w:hAnsi="Source Sans 3"/>
+                <w:color w:val="17201E"/>
+                <w:sz w:val="16"/>
+              </w:rPr>
+              <w:t>https://kakawachocolates.com.au/pages/membership</w:t>
+            </w:r>
+          </w:p>
+        </w:tc>
+        <w:tc>
+          <w:tcPr>
+            <w:tcW w:type="dxa" w:w="1944"/>
+            <w:vAlign w:val="top"/>
+            <w:tcMar>
+              <w:top w:w="90" w:type="dxa"/>
+              <w:start w:w="105" w:type="dxa"/>
+              <w:bottom w:w="90" w:type="dxa"/>
+              <w:end w:w="105" w:type="dxa"/>
+            </w:tcMar>
+          </w:tcPr>
+          <w:p>
+            <w:r>
+              <w:rPr>
+                <w:rFonts w:ascii="Source Sans 3" w:hAnsi="Source Sans 3"/>
+                <w:color w:val="17201E"/>
+                <w:sz w:val="16"/>
+              </w:rPr>
+              <w:t>Refresh existing target; do not create a competing URL</w:t>
+            </w:r>
+          </w:p>
+        </w:tc>
+        <w:tc>
+          <w:tcPr>
+            <w:tcW w:type="dxa" w:w="1080"/>
+            <w:vAlign w:val="top"/>
+            <w:tcMar>
+              <w:top w:w="90" w:type="dxa"/>
+              <w:start w:w="105" w:type="dxa"/>
+              <w:bottom w:w="90" w:type="dxa"/>
+              <w:end w:w="105" w:type="dxa"/>
+            </w:tcMar>
+          </w:tcPr>
+          <w:p>
+            <w:r>
+              <w:rPr>
+                <w:rFonts w:ascii="Source Sans 3" w:hAnsi="Source Sans 3"/>
+                <w:color w:val="17201E"/>
+                <w:sz w:val="16"/>
+              </w:rPr>
+              <w:t>EV-0025</w:t>
+            </w:r>
+          </w:p>
+        </w:tc>
+      </w:tr>
+      <w:tr>
+        <w:tc>
+          <w:tcPr>
+            <w:tcW w:type="dxa" w:w="1800"/>
+            <w:vAlign w:val="top"/>
+            <w:tcMar>
+              <w:top w:w="90" w:type="dxa"/>
+              <w:start w:w="105" w:type="dxa"/>
+              <w:bottom w:w="90" w:type="dxa"/>
+              <w:end w:w="105" w:type="dxa"/>
+            </w:tcMar>
+            <w:shd w:fill="F6F2E9"/>
+          </w:tcPr>
+          <w:p>
+            <w:r>
+              <w:rPr>
+                <w:rFonts w:ascii="Source Sans 3" w:hAnsi="Source Sans 3"/>
+                <w:color w:val="17201E"/>
+                <w:sz w:val="16"/>
+              </w:rPr>
+              <w:t>Chocolate journal discovery hub</w:t>
+            </w:r>
+          </w:p>
+        </w:tc>
+        <w:tc>
+          <w:tcPr>
+            <w:tcW w:type="dxa" w:w="1152"/>
+            <w:vAlign w:val="top"/>
+            <w:tcMar>
+              <w:top w:w="90" w:type="dxa"/>
+              <w:start w:w="105" w:type="dxa"/>
+              <w:bottom w:w="90" w:type="dxa"/>
+              <w:end w:w="105" w:type="dxa"/>
+            </w:tcMar>
+            <w:shd w:fill="F6F2E9"/>
+          </w:tcPr>
+          <w:p>
+            <w:r>
+              <w:rPr>
+                <w:rFonts w:ascii="Source Sans 3" w:hAnsi="Source Sans 3"/>
+                <w:color w:val="17201E"/>
+                <w:sz w:val="16"/>
+              </w:rPr>
+              <w:t>informational discovery</w:t>
+            </w:r>
+          </w:p>
+        </w:tc>
+        <w:tc>
+          <w:tcPr>
+            <w:tcW w:type="dxa" w:w="2592"/>
+            <w:vAlign w:val="top"/>
+            <w:tcMar>
+              <w:top w:w="90" w:type="dxa"/>
+              <w:start w:w="105" w:type="dxa"/>
+              <w:bottom w:w="90" w:type="dxa"/>
+              <w:end w:w="105" w:type="dxa"/>
+            </w:tcMar>
+            <w:shd w:fill="F6F2E9"/>
+          </w:tcPr>
+          <w:p>
+            <w:r>
+              <w:rPr>
+                <w:rFonts w:ascii="Source Sans 3" w:hAnsi="Source Sans 3"/>
+                <w:color w:val="17201E"/>
+                <w:sz w:val="16"/>
+              </w:rPr>
+              <w:t>https://kakawachocolates.com.au/blogs/chocolates</w:t>
+            </w:r>
+          </w:p>
+        </w:tc>
+        <w:tc>
+          <w:tcPr>
+            <w:tcW w:type="dxa" w:w="1944"/>
+            <w:vAlign w:val="top"/>
+            <w:tcMar>
+              <w:top w:w="90" w:type="dxa"/>
+              <w:start w:w="105" w:type="dxa"/>
+              <w:bottom w:w="90" w:type="dxa"/>
+              <w:end w:w="105" w:type="dxa"/>
+            </w:tcMar>
+            <w:shd w:fill="F6F2E9"/>
+          </w:tcPr>
+          <w:p>
+            <w:r>
+              <w:rPr>
+                <w:rFonts w:ascii="Source Sans 3" w:hAnsi="Source Sans 3"/>
+                <w:color w:val="17201E"/>
+                <w:sz w:val="16"/>
+              </w:rPr>
+              <w:t>Refresh existing target; do not create a competing URL</w:t>
+            </w:r>
+          </w:p>
+        </w:tc>
+        <w:tc>
+          <w:tcPr>
+            <w:tcW w:type="dxa" w:w="1080"/>
+            <w:vAlign w:val="top"/>
+            <w:tcMar>
+              <w:top w:w="90" w:type="dxa"/>
+              <w:start w:w="105" w:type="dxa"/>
+              <w:bottom w:w="90" w:type="dxa"/>
+              <w:end w:w="105" w:type="dxa"/>
+            </w:tcMar>
+            <w:shd w:fill="F6F2E9"/>
+          </w:tcPr>
+          <w:p>
+            <w:r>
+              <w:rPr>
+                <w:rFonts w:ascii="Source Sans 3" w:hAnsi="Source Sans 3"/>
+                <w:color w:val="17201E"/>
+                <w:sz w:val="16"/>
+              </w:rPr>
+              <w:t>EV-0002</w:t>
+            </w:r>
+          </w:p>
+        </w:tc>
+      </w:tr>
+      <w:tr>
+        <w:tc>
+          <w:tcPr>
+            <w:tcW w:type="dxa" w:w="1800"/>
+            <w:vAlign w:val="top"/>
+            <w:tcMar>
+              <w:top w:w="90" w:type="dxa"/>
+              <w:start w:w="105" w:type="dxa"/>
+              <w:bottom w:w="90" w:type="dxa"/>
+              <w:end w:w="105" w:type="dxa"/>
+            </w:tcMar>
+          </w:tcPr>
+          <w:p>
+            <w:r>
+              <w:rPr>
+                <w:rFonts w:ascii="Source Sans 3" w:hAnsi="Source Sans 3"/>
+                <w:color w:val="17201E"/>
+                <w:sz w:val="16"/>
+              </w:rPr>
+              <w:t>Christmas chocolate planning guide</w:t>
+            </w:r>
+          </w:p>
+        </w:tc>
+        <w:tc>
+          <w:tcPr>
+            <w:tcW w:type="dxa" w:w="1152"/>
+            <w:vAlign w:val="top"/>
+            <w:tcMar>
+              <w:top w:w="90" w:type="dxa"/>
+              <w:start w:w="105" w:type="dxa"/>
+              <w:bottom w:w="90" w:type="dxa"/>
+              <w:end w:w="105" w:type="dxa"/>
+            </w:tcMar>
+          </w:tcPr>
+          <w:p>
+            <w:r>
+              <w:rPr>
+                <w:rFonts w:ascii="Source Sans 3" w:hAnsi="Source Sans 3"/>
+                <w:color w:val="17201E"/>
+                <w:sz w:val="16"/>
+              </w:rPr>
+              <w:t>seasonal gift discovery</w:t>
+            </w:r>
+          </w:p>
+        </w:tc>
+        <w:tc>
+          <w:tcPr>
+            <w:tcW w:type="dxa" w:w="2592"/>
+            <w:vAlign w:val="top"/>
+            <w:tcMar>
+              <w:top w:w="90" w:type="dxa"/>
+              <w:start w:w="105" w:type="dxa"/>
+              <w:bottom w:w="90" w:type="dxa"/>
+              <w:end w:w="105" w:type="dxa"/>
+            </w:tcMar>
+          </w:tcPr>
+          <w:p>
+            <w:r>
+              <w:rPr>
+                <w:rFonts w:ascii="Source Sans 3" w:hAnsi="Source Sans 3"/>
+                <w:color w:val="17201E"/>
+                <w:sz w:val="16"/>
+              </w:rPr>
+              <w:t>https://kakawachocolates.com.au/collections/christmas</w:t>
+            </w:r>
+          </w:p>
+        </w:tc>
+        <w:tc>
+          <w:tcPr>
+            <w:tcW w:type="dxa" w:w="1944"/>
+            <w:vAlign w:val="top"/>
+            <w:tcMar>
+              <w:top w:w="90" w:type="dxa"/>
+              <w:start w:w="105" w:type="dxa"/>
+              <w:bottom w:w="90" w:type="dxa"/>
+              <w:end w:w="105" w:type="dxa"/>
+            </w:tcMar>
+          </w:tcPr>
+          <w:p>
+            <w:r>
+              <w:rPr>
+                <w:rFonts w:ascii="Source Sans 3" w:hAnsi="Source Sans 3"/>
+                <w:color w:val="17201E"/>
+                <w:sz w:val="16"/>
+              </w:rPr>
+              <w:t>Refresh existing target; do not create a competing URL</w:t>
+            </w:r>
+          </w:p>
+        </w:tc>
+        <w:tc>
+          <w:tcPr>
+            <w:tcW w:type="dxa" w:w="1080"/>
+            <w:vAlign w:val="top"/>
+            <w:tcMar>
+              <w:top w:w="90" w:type="dxa"/>
+              <w:start w:w="105" w:type="dxa"/>
+              <w:bottom w:w="90" w:type="dxa"/>
+              <w:end w:w="105" w:type="dxa"/>
+            </w:tcMar>
+          </w:tcPr>
+          <w:p>
+            <w:r>
+              <w:rPr>
+                <w:rFonts w:ascii="Source Sans 3" w:hAnsi="Source Sans 3"/>
+                <w:color w:val="17201E"/>
+                <w:sz w:val="16"/>
+              </w:rPr>
+              <w:t>EV-0193</w:t>
+            </w:r>
+          </w:p>
+        </w:tc>
+      </w:tr>
+      <w:tr>
+        <w:tc>
+          <w:tcPr>
+            <w:tcW w:type="dxa" w:w="1800"/>
+            <w:vAlign w:val="top"/>
+            <w:tcMar>
+              <w:top w:w="90" w:type="dxa"/>
+              <w:start w:w="105" w:type="dxa"/>
+              <w:bottom w:w="90" w:type="dxa"/>
+              <w:end w:w="105" w:type="dxa"/>
+            </w:tcMar>
+            <w:shd w:fill="F6F2E9"/>
+          </w:tcPr>
+          <w:p>
+            <w:r>
+              <w:rPr>
+                <w:rFonts w:ascii="Source Sans 3" w:hAnsi="Source Sans 3"/>
+                <w:color w:val="17201E"/>
+                <w:sz w:val="16"/>
+              </w:rPr>
+              <w:t>Easter chocolate planning guide</w:t>
+            </w:r>
+          </w:p>
+        </w:tc>
+        <w:tc>
+          <w:tcPr>
+            <w:tcW w:type="dxa" w:w="1152"/>
+            <w:vAlign w:val="top"/>
+            <w:tcMar>
+              <w:top w:w="90" w:type="dxa"/>
+              <w:start w:w="105" w:type="dxa"/>
+              <w:bottom w:w="90" w:type="dxa"/>
+              <w:end w:w="105" w:type="dxa"/>
+            </w:tcMar>
+            <w:shd w:fill="F6F2E9"/>
+          </w:tcPr>
+          <w:p>
+            <w:r>
+              <w:rPr>
+                <w:rFonts w:ascii="Source Sans 3" w:hAnsi="Source Sans 3"/>
+                <w:color w:val="17201E"/>
+                <w:sz w:val="16"/>
+              </w:rPr>
+              <w:t>seasonal gift discovery</w:t>
+            </w:r>
+          </w:p>
+        </w:tc>
+        <w:tc>
+          <w:tcPr>
+            <w:tcW w:type="dxa" w:w="2592"/>
+            <w:vAlign w:val="top"/>
+            <w:tcMar>
+              <w:top w:w="90" w:type="dxa"/>
+              <w:start w:w="105" w:type="dxa"/>
+              <w:bottom w:w="90" w:type="dxa"/>
+              <w:end w:w="105" w:type="dxa"/>
+            </w:tcMar>
+            <w:shd w:fill="F6F2E9"/>
+          </w:tcPr>
+          <w:p>
+            <w:r>
+              <w:rPr>
+                <w:rFonts w:ascii="Source Sans 3" w:hAnsi="Source Sans 3"/>
+                <w:color w:val="17201E"/>
+                <w:sz w:val="16"/>
+              </w:rPr>
+              <w:t>https://kakawachocolates.com.au/collections/easter</w:t>
+            </w:r>
+          </w:p>
+        </w:tc>
+        <w:tc>
+          <w:tcPr>
+            <w:tcW w:type="dxa" w:w="1944"/>
+            <w:vAlign w:val="top"/>
+            <w:tcMar>
+              <w:top w:w="90" w:type="dxa"/>
+              <w:start w:w="105" w:type="dxa"/>
+              <w:bottom w:w="90" w:type="dxa"/>
+              <w:end w:w="105" w:type="dxa"/>
+            </w:tcMar>
+            <w:shd w:fill="F6F2E9"/>
+          </w:tcPr>
+          <w:p>
+            <w:r>
+              <w:rPr>
+                <w:rFonts w:ascii="Source Sans 3" w:hAnsi="Source Sans 3"/>
+                <w:color w:val="17201E"/>
+                <w:sz w:val="16"/>
+              </w:rPr>
+              <w:t>Refresh existing target; do not create a competing URL</w:t>
+            </w:r>
+          </w:p>
+        </w:tc>
+        <w:tc>
+          <w:tcPr>
+            <w:tcW w:type="dxa" w:w="1080"/>
+            <w:vAlign w:val="top"/>
+            <w:tcMar>
+              <w:top w:w="90" w:type="dxa"/>
+              <w:start w:w="105" w:type="dxa"/>
+              <w:bottom w:w="90" w:type="dxa"/>
+              <w:end w:w="105" w:type="dxa"/>
+            </w:tcMar>
+            <w:shd w:fill="F6F2E9"/>
+          </w:tcPr>
+          <w:p>
+            <w:r>
+              <w:rPr>
+                <w:rFonts w:ascii="Source Sans 3" w:hAnsi="Source Sans 3"/>
+                <w:color w:val="17201E"/>
+                <w:sz w:val="16"/>
+              </w:rPr>
+              <w:t>EV-0194</w:t>
             </w:r>
           </w:p>
         </w:tc>

</xml_diff>